<commit_message>
Edited cross references in docx format
</commit_message>
<xml_diff>
--- a/Отчёт.docx
+++ b/Отчёт.docx
@@ -17,15 +17,7 @@
           <w:szCs w:val="28"/>
           <w:lang w:val="ru-RU"/>
         </w:rPr>
-        <w:t>МОСКОВСКИЙ ФИЗИКО-</w:t>
-      </w:r>
-      <w:r>
-        <w:rPr>
-          <w:sz w:val="28"/>
-          <w:szCs w:val="28"/>
-          <w:lang w:val="ru-RU"/>
-        </w:rPr>
-        <w:t>ТЕХНИЧЕСКИЙ ИНСТИТУТ(НАЦИОНАЛЬНЫЙ ГОСУДАРСТВЕННЫЙ УНИВЕРСИТЕТ)</w:t>
+        <w:t>МОСКОВСКИЙ ФИЗИКО-ТЕХНИЧЕСКИЙ ИНСТИТУТ(НАЦИОНАЛЬНЫЙ ГОСУДАРСТВЕННЫЙ УНИВЕРСИТЕТ)</w:t>
       </w:r>
     </w:p>
     <w:p>
@@ -330,6 +322,14 @@
     </w:p>
     <w:sdt>
       <w:sdtPr>
+        <w:rPr>
+          <w:rFonts w:ascii="Times New Roman" w:eastAsiaTheme="minorHAnsi" w:hAnsi="Times New Roman" w:cstheme="minorBidi"/>
+          <w:color w:val="auto"/>
+          <w:kern w:val="2"/>
+          <w:sz w:val="24"/>
+          <w:szCs w:val="24"/>
+          <w14:ligatures w14:val="standardContextual"/>
+        </w:rPr>
         <w:id w:val="891853390"/>
         <w:docPartObj>
           <w:docPartGallery w:val="Table of Contents"/>
@@ -338,15 +338,9 @@
       </w:sdtPr>
       <w:sdtEndPr>
         <w:rPr>
-          <w:rFonts w:ascii="Times New Roman" w:eastAsiaTheme="minorHAnsi" w:hAnsi="Times New Roman" w:cstheme="minorBidi"/>
           <w:b/>
           <w:bCs/>
           <w:noProof/>
-          <w:color w:val="auto"/>
-          <w:kern w:val="2"/>
-          <w:sz w:val="24"/>
-          <w:szCs w:val="24"/>
-          <w14:ligatures w14:val="standardContextual"/>
         </w:rPr>
       </w:sdtEndPr>
       <w:sdtContent>
@@ -389,7 +383,7 @@
           <w:r>
             <w:fldChar w:fldCharType="separate"/>
           </w:r>
-          <w:hyperlink w:anchor="_Toc197943906" w:history="1">
+          <w:hyperlink w:anchor="_Toc198105534" w:history="1">
             <w:r>
               <w:rPr>
                 <w:rStyle w:val="Hyperlink"/>
@@ -432,7 +426,7 @@
                 <w:noProof/>
                 <w:webHidden/>
               </w:rPr>
-              <w:instrText xml:space="preserve"> PAGEREF _Toc197943906 \h </w:instrText>
+              <w:instrText xml:space="preserve"> PAGEREF _Toc198105534 \h </w:instrText>
             </w:r>
             <w:r>
               <w:rPr>
@@ -475,7 +469,7 @@
               <w:noProof/>
             </w:rPr>
           </w:pPr>
-          <w:hyperlink w:anchor="_Toc197943907" w:history="1">
+          <w:hyperlink w:anchor="_Toc198105535" w:history="1">
             <w:r>
               <w:rPr>
                 <w:rStyle w:val="Hyperlink"/>
@@ -518,7 +512,7 @@
                 <w:noProof/>
                 <w:webHidden/>
               </w:rPr>
-              <w:instrText xml:space="preserve"> PAGEREF _Toc197943907 \h </w:instrText>
+              <w:instrText xml:space="preserve"> PAGEREF _Toc198105535 \h </w:instrText>
             </w:r>
             <w:r>
               <w:rPr>
@@ -561,7 +555,7 @@
               <w:noProof/>
             </w:rPr>
           </w:pPr>
-          <w:hyperlink w:anchor="_Toc197943908" w:history="1">
+          <w:hyperlink w:anchor="_Toc198105536" w:history="1">
             <w:r>
               <w:rPr>
                 <w:rStyle w:val="Hyperlink"/>
@@ -604,7 +598,7 @@
                 <w:noProof/>
                 <w:webHidden/>
               </w:rPr>
-              <w:instrText xml:space="preserve"> PAGEREF _Toc197943908 \h </w:instrText>
+              <w:instrText xml:space="preserve"> PAGEREF _Toc198105536 \h </w:instrText>
             </w:r>
             <w:r>
               <w:rPr>
@@ -647,7 +641,7 @@
               <w:noProof/>
             </w:rPr>
           </w:pPr>
-          <w:hyperlink w:anchor="_Toc197943909" w:history="1">
+          <w:hyperlink w:anchor="_Toc198105537" w:history="1">
             <w:r>
               <w:rPr>
                 <w:rStyle w:val="Hyperlink"/>
@@ -690,7 +684,7 @@
                 <w:noProof/>
                 <w:webHidden/>
               </w:rPr>
-              <w:instrText xml:space="preserve"> PAGEREF _Toc197943909 \h </w:instrText>
+              <w:instrText xml:space="preserve"> PAGEREF _Toc198105537 \h </w:instrText>
             </w:r>
             <w:r>
               <w:rPr>
@@ -733,7 +727,7 @@
               <w:noProof/>
             </w:rPr>
           </w:pPr>
-          <w:hyperlink w:anchor="_Toc197943910" w:history="1">
+          <w:hyperlink w:anchor="_Toc198105538" w:history="1">
             <w:r>
               <w:rPr>
                 <w:rStyle w:val="Hyperlink"/>
@@ -776,7 +770,7 @@
                 <w:noProof/>
                 <w:webHidden/>
               </w:rPr>
-              <w:instrText xml:space="preserve"> PAGEREF _Toc197943910 \h </w:instrText>
+              <w:instrText xml:space="preserve"> PAGEREF _Toc198105538 \h </w:instrText>
             </w:r>
             <w:r>
               <w:rPr>
@@ -819,7 +813,7 @@
               <w:noProof/>
             </w:rPr>
           </w:pPr>
-          <w:hyperlink w:anchor="_Toc197943911" w:history="1">
+          <w:hyperlink w:anchor="_Toc198105539" w:history="1">
             <w:r>
               <w:rPr>
                 <w:rStyle w:val="Hyperlink"/>
@@ -862,7 +856,7 @@
                 <w:noProof/>
                 <w:webHidden/>
               </w:rPr>
-              <w:instrText xml:space="preserve"> PAGEREF _Toc197943911 \h </w:instrText>
+              <w:instrText xml:space="preserve"> PAGEREF _Toc198105539 \h </w:instrText>
             </w:r>
             <w:r>
               <w:rPr>
@@ -905,7 +899,7 @@
               <w:noProof/>
             </w:rPr>
           </w:pPr>
-          <w:hyperlink w:anchor="_Toc197943912" w:history="1">
+          <w:hyperlink w:anchor="_Toc198105540" w:history="1">
             <w:r>
               <w:rPr>
                 <w:rStyle w:val="Hyperlink"/>
@@ -947,7 +941,7 @@
                 <w:noProof/>
                 <w:webHidden/>
               </w:rPr>
-              <w:instrText xml:space="preserve"> PAGEREF _Toc197943912 \h </w:instrText>
+              <w:instrText xml:space="preserve"> PAGEREF _Toc198105540 \h </w:instrText>
             </w:r>
             <w:r>
               <w:rPr>
@@ -990,7 +984,7 @@
               <w:noProof/>
             </w:rPr>
           </w:pPr>
-          <w:hyperlink w:anchor="_Toc197943913" w:history="1">
+          <w:hyperlink w:anchor="_Toc198105541" w:history="1">
             <w:r>
               <w:rPr>
                 <w:rStyle w:val="Hyperlink"/>
@@ -1033,7 +1027,7 @@
                 <w:noProof/>
                 <w:webHidden/>
               </w:rPr>
-              <w:instrText xml:space="preserve"> PAGEREF _Toc197943913 \h </w:instrText>
+              <w:instrText xml:space="preserve"> PAGEREF _Toc198105541 \h </w:instrText>
             </w:r>
             <w:r>
               <w:rPr>
@@ -1076,7 +1070,7 @@
               <w:noProof/>
             </w:rPr>
           </w:pPr>
-          <w:hyperlink w:anchor="_Toc197943914" w:history="1">
+          <w:hyperlink w:anchor="_Toc198105542" w:history="1">
             <w:r>
               <w:rPr>
                 <w:rStyle w:val="Hyperlink"/>
@@ -1119,7 +1113,7 @@
                 <w:noProof/>
                 <w:webHidden/>
               </w:rPr>
-              <w:instrText xml:space="preserve"> PAGEREF _Toc197943914 \h </w:instrText>
+              <w:instrText xml:space="preserve"> PAGEREF _Toc198105542 \h </w:instrText>
             </w:r>
             <w:r>
               <w:rPr>
@@ -1162,7 +1156,7 @@
               <w:noProof/>
             </w:rPr>
           </w:pPr>
-          <w:hyperlink w:anchor="_Toc197943915" w:history="1">
+          <w:hyperlink w:anchor="_Toc198105543" w:history="1">
             <w:r>
               <w:rPr>
                 <w:rStyle w:val="Hyperlink"/>
@@ -1205,7 +1199,7 @@
                 <w:noProof/>
                 <w:webHidden/>
               </w:rPr>
-              <w:instrText xml:space="preserve"> PAGEREF _Toc197943915 \h </w:instrText>
+              <w:instrText xml:space="preserve"> PAGEREF _Toc198105543 \h </w:instrText>
             </w:r>
             <w:r>
               <w:rPr>
@@ -1308,7 +1302,7 @@
           <w:lang w:val="ru-RU"/>
         </w:rPr>
       </w:pPr>
-      <w:bookmarkStart w:id="0" w:name="_Toc197943906"/>
+      <w:bookmarkStart w:id="0" w:name="_Toc198105534"/>
       <w:r>
         <w:rPr>
           <w:lang w:val="ru-RU"/>
@@ -1325,7 +1319,7 @@
           <w:lang w:val="ru-RU"/>
         </w:rPr>
       </w:pPr>
-      <w:bookmarkStart w:id="1" w:name="_Toc197943907"/>
+      <w:bookmarkStart w:id="1" w:name="_Toc198105535"/>
       <w:r>
         <w:rPr>
           <w:lang w:val="ru-RU"/>
@@ -1354,7 +1348,7 @@
           <w:lang w:val="ru-RU"/>
         </w:rPr>
       </w:pPr>
-      <w:bookmarkStart w:id="2" w:name="_Toc197943908"/>
+      <w:bookmarkStart w:id="2" w:name="_Toc198105536"/>
       <w:r>
         <w:rPr>
           <w:lang w:val="ru-RU"/>
@@ -1420,7 +1414,7 @@
           <w:lang w:val="ru-RU"/>
         </w:rPr>
       </w:pPr>
-      <w:bookmarkStart w:id="3" w:name="_Toc197943909"/>
+      <w:bookmarkStart w:id="3" w:name="_Toc198105537"/>
       <w:r>
         <w:rPr>
           <w:lang w:val="ru-RU"/>
@@ -1436,7 +1430,7 @@
           <w:lang w:val="ru-RU"/>
         </w:rPr>
       </w:pPr>
-      <w:bookmarkStart w:id="4" w:name="_Toc197943910"/>
+      <w:bookmarkStart w:id="4" w:name="_Toc198105538"/>
       <w:r>
         <w:rPr>
           <w:lang w:val="ru-RU"/>
@@ -1509,6 +1503,11 @@
       </w:r>
     </w:p>
     <w:p>
+      <w:pPr>
+        <w:rPr>
+          <w:lang w:val="ru-RU"/>
+        </w:rPr>
+      </w:pPr>
       <w:r>
         <w:rPr>
           <w:lang w:val="ru-RU"/>
@@ -1580,7 +1579,7 @@
           <w:lang w:val="ru-RU"/>
         </w:rPr>
       </w:pPr>
-      <w:bookmarkStart w:id="5" w:name="_Toc197943911"/>
+      <w:bookmarkStart w:id="5" w:name="_Toc198105539"/>
       <w:r>
         <w:rPr>
           <w:lang w:val="ru-RU"/>
@@ -1600,29 +1599,51 @@
         <w:rPr>
           <w:lang w:val="ru-RU"/>
         </w:rPr>
-        <w:t xml:space="preserve">Зависимость напряжения на конденсаторе описывается формулой </w:t>
-      </w:r>
-      <w:r>
-        <w:rPr>
-          <w:lang w:val="ru-RU"/>
-        </w:rPr>
+        <w:t>Зависимость напряжения на конденсаторе описывается формулой</w:t>
+      </w:r>
+      <w:r>
+        <w:rPr>
+          <w:lang w:val="ru-RU"/>
+        </w:rPr>
+        <w:t xml:space="preserve"> </w:t>
+      </w:r>
+      <w:r>
         <w:fldChar w:fldCharType="begin"/>
       </w:r>
       <w:r>
         <w:rPr>
           <w:lang w:val="ru-RU"/>
         </w:rPr>
-        <w:instrText xml:space="preserve"> REF _Ref197943477 \h </w:instrText>
-      </w:r>
-      <w:r>
-        <w:rPr>
-          <w:lang w:val="ru-RU"/>
-        </w:rPr>
-      </w:r>
-      <w:r>
-        <w:rPr>
-          <w:lang w:val="ru-RU"/>
-        </w:rPr>
+        <w:instrText xml:space="preserve"> </w:instrText>
+      </w:r>
+      <w:r>
+        <w:instrText>REF</w:instrText>
+      </w:r>
+      <w:r>
+        <w:rPr>
+          <w:lang w:val="ru-RU"/>
+        </w:rPr>
+        <w:instrText xml:space="preserve"> _</w:instrText>
+      </w:r>
+      <w:r>
+        <w:instrText>Ref</w:instrText>
+      </w:r>
+      <w:r>
+        <w:rPr>
+          <w:lang w:val="ru-RU"/>
+        </w:rPr>
+        <w:instrText>198105518 \</w:instrText>
+      </w:r>
+      <w:r>
+        <w:instrText>h</w:instrText>
+      </w:r>
+      <w:r>
+        <w:rPr>
+          <w:lang w:val="ru-RU"/>
+        </w:rPr>
+        <w:instrText xml:space="preserve"> </w:instrText>
+      </w:r>
+      <w:r>
         <w:fldChar w:fldCharType="separate"/>
       </w:r>
       <w:r>
@@ -1633,9 +1654,6 @@
         <w:t>1</w:t>
       </w:r>
       <w:r>
-        <w:rPr>
-          <w:lang w:val="ru-RU"/>
-        </w:rPr>
         <w:fldChar w:fldCharType="end"/>
       </w:r>
       <w:r>
@@ -1656,6 +1674,7 @@
         <w:tab/>
       </w:r>
       <w:bookmarkStart w:id="6" w:name="_Ref197943477"/>
+      <w:bookmarkStart w:id="7" w:name="_Ref198105518"/>
       <m:oMath>
         <m:sSup>
           <m:sSupPr>
@@ -1721,14 +1740,7 @@
                 <w:rFonts w:ascii="Cambria Math" w:eastAsiaTheme="minorHAnsi" w:hAnsi="Cambria Math"/>
                 <w:lang w:val="ru-RU"/>
               </w:rPr>
-              <m:t>-</m:t>
-            </m:r>
-            <m:r>
-              <w:rPr>
-                <w:rFonts w:ascii="Cambria Math" w:eastAsiaTheme="minorHAnsi" w:hAnsi="Cambria Math"/>
-                <w:lang w:val="ru-RU"/>
-              </w:rPr>
-              <m:t>t</m:t>
+              <m:t>-t</m:t>
             </m:r>
             <m:r>
               <w:rPr>
@@ -1746,15 +1758,26 @@
         <w:tab/>
         <w:t>(</w:t>
       </w:r>
-      <w:fldSimple w:instr=" SEQ _ \* ARABIC ">
-        <w:r>
-          <w:rPr>
-            <w:noProof/>
-          </w:rPr>
-          <w:t>1</w:t>
-        </w:r>
-      </w:fldSimple>
       <w:bookmarkEnd w:id="6"/>
+      <w:r>
+        <w:fldChar w:fldCharType="begin"/>
+      </w:r>
+      <w:r>
+        <w:instrText xml:space="preserve"> SEQ Формула \* ARABIC </w:instrText>
+      </w:r>
+      <w:r>
+        <w:fldChar w:fldCharType="separate"/>
+      </w:r>
+      <w:r>
+        <w:rPr>
+          <w:noProof/>
+        </w:rPr>
+        <w:t>1</w:t>
+      </w:r>
+      <w:r>
+        <w:fldChar w:fldCharType="end"/>
+      </w:r>
+      <w:bookmarkEnd w:id="7"/>
       <w:r>
         <w:t>)</w:t>
       </w:r>
@@ -1778,7 +1801,7 @@
         <w:tab/>
         <w:t>(</w:t>
       </w:r>
-      <w:fldSimple w:instr=" SEQ _ \* ARABIC ">
+      <w:fldSimple w:instr=" SEQ Формула \* ARABIC ">
         <w:r>
           <w:rPr>
             <w:noProof/>
@@ -1794,14 +1817,14 @@
       <w:pPr>
         <w:pStyle w:val="Heading2"/>
       </w:pPr>
-      <w:bookmarkStart w:id="7" w:name="_Toc197943912"/>
+      <w:bookmarkStart w:id="8" w:name="_Toc198105540"/>
       <w:r>
         <w:rPr>
           <w:lang w:val="ru-RU"/>
         </w:rPr>
         <w:t>Экспериментальная установка</w:t>
       </w:r>
-      <w:bookmarkEnd w:id="7"/>
+      <w:bookmarkEnd w:id="8"/>
     </w:p>
     <w:p>
       <w:pPr>
@@ -1825,7 +1848,19 @@
         <w:rPr>
           <w:lang w:val="ru-RU"/>
         </w:rPr>
-        <w:instrText xml:space="preserve"> REF _Ref197943381 \h </w:instrText>
+        <w:instrText xml:space="preserve"> REF _Ref197943381</w:instrText>
+      </w:r>
+      <w:r>
+        <w:rPr>
+          <w:lang w:val="ru-RU"/>
+        </w:rPr>
+        <w:instrText xml:space="preserve"> \# 0</w:instrText>
+      </w:r>
+      <w:r>
+        <w:rPr>
+          <w:lang w:val="ru-RU"/>
+        </w:rPr>
+        <w:instrText xml:space="preserve"> \h </w:instrText>
       </w:r>
       <w:r>
         <w:rPr>
@@ -1840,7 +1875,6 @@
       </w:r>
       <w:r>
         <w:rPr>
-          <w:noProof/>
           <w:lang w:val="ru-RU"/>
         </w:rPr>
         <w:t>1</w:t>
@@ -1912,7 +1946,19 @@
         <w:rPr>
           <w:lang w:val="ru-RU"/>
         </w:rPr>
-        <w:instrText xml:space="preserve"> REF _Ref197943425 \h </w:instrText>
+        <w:instrText xml:space="preserve"> REF _Ref197943425</w:instrText>
+      </w:r>
+      <w:r>
+        <w:rPr>
+          <w:lang w:val="ru-RU"/>
+        </w:rPr>
+        <w:instrText xml:space="preserve"> \# 0</w:instrText>
+      </w:r>
+      <w:r>
+        <w:rPr>
+          <w:lang w:val="ru-RU"/>
+        </w:rPr>
+        <w:instrText xml:space="preserve"> \h </w:instrText>
       </w:r>
       <w:r>
         <w:rPr>
@@ -1927,7 +1973,6 @@
       </w:r>
       <w:r>
         <w:rPr>
-          <w:noProof/>
           <w:lang w:val="ru-RU"/>
         </w:rPr>
         <w:t>2</w:t>
@@ -2039,7 +2084,7 @@
                 <w:noProof w:val="0"/>
               </w:rPr>
             </w:pPr>
-            <w:bookmarkStart w:id="8" w:name="_Ref197943381"/>
+            <w:bookmarkStart w:id="9" w:name="_Ref197943381"/>
             <w:r>
               <w:t xml:space="preserve">Рисунок </w:t>
             </w:r>
@@ -2070,7 +2115,7 @@
             <w:r>
               <w:fldChar w:fldCharType="end"/>
             </w:r>
-            <w:bookmarkEnd w:id="8"/>
+            <w:bookmarkEnd w:id="9"/>
             <w:r>
               <w:t xml:space="preserve"> - вид изучаемого модуля</w:t>
             </w:r>
@@ -2144,7 +2189,7 @@
                 <w:lang w:val="en-US"/>
               </w:rPr>
             </w:pPr>
-            <w:bookmarkStart w:id="9" w:name="_Ref197943425"/>
+            <w:bookmarkStart w:id="10" w:name="_Ref197943425"/>
             <w:r>
               <w:t xml:space="preserve">Рисунок </w:t>
             </w:r>
@@ -2163,7 +2208,7 @@
             <w:r>
               <w:fldChar w:fldCharType="end"/>
             </w:r>
-            <w:bookmarkEnd w:id="9"/>
+            <w:bookmarkEnd w:id="10"/>
             <w:r>
               <w:t xml:space="preserve"> - схема RC-цепи</w:t>
             </w:r>
@@ -2194,14 +2239,14 @@
           <w:lang w:val="ru-RU"/>
         </w:rPr>
       </w:pPr>
-      <w:bookmarkStart w:id="10" w:name="_Toc197943913"/>
+      <w:bookmarkStart w:id="11" w:name="_Toc198105541"/>
       <w:r>
         <w:rPr>
           <w:lang w:val="ru-RU"/>
         </w:rPr>
         <w:t>Программа и методика измерений</w:t>
       </w:r>
-      <w:bookmarkEnd w:id="10"/>
+      <w:bookmarkEnd w:id="11"/>
     </w:p>
     <w:p>
       <w:pPr>
@@ -2245,14 +2290,14 @@
           <w:lang w:val="ru-RU"/>
         </w:rPr>
       </w:pPr>
-      <w:bookmarkStart w:id="11" w:name="_Toc197943914"/>
+      <w:bookmarkStart w:id="12" w:name="_Toc198105542"/>
       <w:r>
         <w:rPr>
           <w:lang w:val="ru-RU"/>
         </w:rPr>
         <w:t>Обработка данных</w:t>
       </w:r>
-      <w:bookmarkEnd w:id="11"/>
+      <w:bookmarkEnd w:id="12"/>
     </w:p>
     <w:p>
       <w:pPr>
@@ -2288,7 +2333,13 @@
         <w:rPr>
           <w:lang w:val="ru-RU"/>
         </w:rPr>
-        <w:t xml:space="preserve">) </w:t>
+        <w:t>)</w:t>
+      </w:r>
+      <w:r>
+        <w:rPr>
+          <w:lang w:val="ru-RU"/>
+        </w:rPr>
+        <w:t xml:space="preserve"> </w:t>
       </w:r>
       <w:r>
         <w:rPr>
@@ -2297,26 +2348,42 @@
         <w:t>(</w:t>
       </w:r>
       <w:r>
-        <w:rPr>
-          <w:lang w:val="ru-RU"/>
-        </w:rPr>
         <w:fldChar w:fldCharType="begin"/>
       </w:r>
       <w:r>
         <w:rPr>
           <w:lang w:val="ru-RU"/>
         </w:rPr>
-        <w:instrText xml:space="preserve"> REF _Ref197943592 \h </w:instrText>
-      </w:r>
-      <w:r>
-        <w:rPr>
-          <w:lang w:val="ru-RU"/>
-        </w:rPr>
-      </w:r>
-      <w:r>
-        <w:rPr>
-          <w:lang w:val="ru-RU"/>
-        </w:rPr>
+        <w:instrText xml:space="preserve"> </w:instrText>
+      </w:r>
+      <w:r>
+        <w:instrText>REF</w:instrText>
+      </w:r>
+      <w:r>
+        <w:rPr>
+          <w:lang w:val="ru-RU"/>
+        </w:rPr>
+        <w:instrText xml:space="preserve"> _</w:instrText>
+      </w:r>
+      <w:r>
+        <w:instrText>Ref</w:instrText>
+      </w:r>
+      <w:r>
+        <w:rPr>
+          <w:lang w:val="ru-RU"/>
+        </w:rPr>
+        <w:instrText>198105619 \# 0 \</w:instrText>
+      </w:r>
+      <w:r>
+        <w:instrText>h</w:instrText>
+      </w:r>
+      <w:r>
+        <w:rPr>
+          <w:lang w:val="ru-RU"/>
+        </w:rPr>
+        <w:instrText xml:space="preserve"> </w:instrText>
+      </w:r>
+      <w:r>
         <w:fldChar w:fldCharType="separate"/>
       </w:r>
       <w:r>
@@ -2333,22 +2400,37 @@
         <w:t>3</w:t>
       </w:r>
       <w:r>
-        <w:rPr>
-          <w:lang w:val="ru-RU"/>
-        </w:rPr>
-        <w:t>)</w:t>
-      </w:r>
-      <w:r>
-        <w:rPr>
-          <w:lang w:val="ru-RU"/>
-        </w:rPr>
         <w:fldChar w:fldCharType="end"/>
       </w:r>
       <w:r>
         <w:rPr>
           <w:lang w:val="ru-RU"/>
         </w:rPr>
-        <w:t xml:space="preserve">. Можно увидеть, что график имеет форму экспоненты. </w:t>
+        <w:t>).</w:t>
+      </w:r>
+      <w:r>
+        <w:rPr>
+          <w:lang w:val="ru-RU"/>
+        </w:rPr>
+        <w:t xml:space="preserve"> Можно увидеть, что график имеет форму экспоненты</w:t>
+      </w:r>
+      <w:r>
+        <w:rPr>
+          <w:lang w:val="ru-RU"/>
+        </w:rPr>
+        <w:t xml:space="preserve">, </w:t>
+      </w:r>
+      <w:r>
+        <w:rPr>
+          <w:lang w:val="ru-RU"/>
+        </w:rPr>
+        <w:t>что и предсказывалось теорией</w:t>
+      </w:r>
+      <w:r>
+        <w:rPr>
+          <w:lang w:val="ru-RU"/>
+        </w:rPr>
+        <w:t xml:space="preserve">. </w:t>
       </w:r>
     </w:p>
     <w:p>
@@ -2411,7 +2493,7 @@
       <w:pPr>
         <w:pStyle w:val="a0"/>
       </w:pPr>
-      <w:bookmarkStart w:id="12" w:name="_Ref197943592"/>
+      <w:bookmarkStart w:id="13" w:name="_Ref198105619"/>
       <w:r>
         <w:t xml:space="preserve">Рисунок </w:t>
       </w:r>
@@ -2419,7 +2501,19 @@
         <w:fldChar w:fldCharType="begin"/>
       </w:r>
       <w:r>
-        <w:instrText xml:space="preserve"> SEQ Рисунок \* ARABIC </w:instrText>
+        <w:instrText xml:space="preserve"> </w:instrText>
+      </w:r>
+      <w:r>
+        <w:instrText>SEQ</w:instrText>
+      </w:r>
+      <w:r>
+        <w:instrText xml:space="preserve"> Рисунок \* </w:instrText>
+      </w:r>
+      <w:r>
+        <w:instrText>ARABIC</w:instrText>
+      </w:r>
+      <w:r>
+        <w:instrText xml:space="preserve"> </w:instrText>
       </w:r>
       <w:r>
         <w:fldChar w:fldCharType="separate"/>
@@ -2430,10 +2524,22 @@
       <w:r>
         <w:fldChar w:fldCharType="end"/>
       </w:r>
-      <w:r>
-        <w:t xml:space="preserve"> - график зависимости U(t)</w:t>
-      </w:r>
-      <w:bookmarkEnd w:id="12"/>
+      <w:bookmarkEnd w:id="13"/>
+      <w:r>
+        <w:t xml:space="preserve"> – </w:t>
+      </w:r>
+      <w:r>
+        <w:t>график зависимости U</w:t>
+      </w:r>
+      <w:r>
+        <w:t>(</w:t>
+      </w:r>
+      <w:r>
+        <w:t>t</w:t>
+      </w:r>
+      <w:r>
+        <w:t>)</w:t>
+      </w:r>
     </w:p>
     <w:p>
       <w:pPr>
@@ -2442,14 +2548,14 @@
           <w:lang w:val="ru-RU"/>
         </w:rPr>
       </w:pPr>
-      <w:bookmarkStart w:id="13" w:name="_Toc197943915"/>
+      <w:bookmarkStart w:id="14" w:name="_Toc198105543"/>
       <w:r>
         <w:rPr>
           <w:lang w:val="ru-RU"/>
         </w:rPr>
         <w:t>Результаты</w:t>
       </w:r>
-      <w:bookmarkEnd w:id="13"/>
+      <w:bookmarkEnd w:id="14"/>
     </w:p>
     <w:p>
       <w:pPr>
@@ -3499,6 +3605,7 @@
   <w:style w:type="character" w:default="1" w:styleId="DefaultParagraphFont">
     <w:name w:val="Default Paragraph Font"/>
     <w:uiPriority w:val="1"/>
+    <w:semiHidden/>
     <w:unhideWhenUsed/>
   </w:style>
   <w:style w:type="table" w:default="1" w:styleId="TableNormal">
@@ -3686,6 +3793,7 @@
       <w:numPr>
         <w:ilvl w:val="1"/>
       </w:numPr>
+      <w:ind w:firstLine="567"/>
     </w:pPr>
     <w:rPr>
       <w:rFonts w:eastAsiaTheme="majorEastAsia" w:cstheme="majorBidi"/>

</xml_diff>

<commit_message>
Fixed paragraph alignment (1cm)
</commit_message>
<xml_diff>
--- a/Отчёт.docx
+++ b/Отчёт.docx
@@ -1584,93 +1584,93 @@
         <w:rPr>
           <w:lang w:val="ru-RU"/>
         </w:rPr>
+        <w:t>Физическая система</w:t>
+      </w:r>
+      <w:bookmarkEnd w:id="5"/>
+    </w:p>
+    <w:p>
+      <w:pPr>
+        <w:rPr>
+          <w:lang w:val="ru-RU"/>
+        </w:rPr>
+      </w:pPr>
+      <w:r>
+        <w:rPr>
+          <w:lang w:val="ru-RU"/>
+        </w:rPr>
+        <w:t>Зависимость напряжения на конденсаторе описывается формулой</w:t>
+      </w:r>
+      <w:r>
+        <w:rPr>
+          <w:lang w:val="ru-RU"/>
+        </w:rPr>
+        <w:t xml:space="preserve"> </w:t>
+      </w:r>
+      <w:r>
+        <w:fldChar w:fldCharType="begin"/>
+      </w:r>
+      <w:r>
+        <w:rPr>
+          <w:lang w:val="ru-RU"/>
+        </w:rPr>
+        <w:instrText xml:space="preserve"> </w:instrText>
+      </w:r>
+      <w:r>
+        <w:instrText>REF</w:instrText>
+      </w:r>
+      <w:r>
+        <w:rPr>
+          <w:lang w:val="ru-RU"/>
+        </w:rPr>
+        <w:instrText xml:space="preserve"> _</w:instrText>
+      </w:r>
+      <w:r>
+        <w:instrText>Ref</w:instrText>
+      </w:r>
+      <w:r>
+        <w:rPr>
+          <w:lang w:val="ru-RU"/>
+        </w:rPr>
+        <w:instrText>198105518 \</w:instrText>
+      </w:r>
+      <w:r>
+        <w:instrText>h</w:instrText>
+      </w:r>
+      <w:r>
+        <w:rPr>
+          <w:lang w:val="ru-RU"/>
+        </w:rPr>
+        <w:instrText xml:space="preserve"> </w:instrText>
+      </w:r>
+      <w:r>
+        <w:fldChar w:fldCharType="separate"/>
+      </w:r>
+      <w:r>
+        <w:rPr>
+          <w:noProof/>
+          <w:lang w:val="ru-RU"/>
+        </w:rPr>
+        <w:t>1</w:t>
+      </w:r>
+      <w:r>
+        <w:fldChar w:fldCharType="end"/>
+      </w:r>
+      <w:r>
+        <w:rPr>
+          <w:lang w:val="ru-RU"/>
+        </w:rPr>
+        <w:t>.</w:t>
+      </w:r>
+    </w:p>
+    <w:p>
+      <w:pPr>
+        <w:pStyle w:val="a1"/>
+      </w:pPr>
+      <w:r>
+        <w:rPr>
+          <w:lang w:val="ru-RU"/>
+        </w:rPr>
         <w:lastRenderedPageBreak/>
-        <w:t>Физическая система</w:t>
-      </w:r>
-      <w:bookmarkEnd w:id="5"/>
-    </w:p>
-    <w:p>
-      <w:pPr>
-        <w:rPr>
-          <w:lang w:val="ru-RU"/>
-        </w:rPr>
-      </w:pPr>
-      <w:r>
-        <w:rPr>
-          <w:lang w:val="ru-RU"/>
-        </w:rPr>
-        <w:t>Зависимость напряжения на конденсаторе описывается формулой</w:t>
-      </w:r>
-      <w:r>
-        <w:rPr>
-          <w:lang w:val="ru-RU"/>
-        </w:rPr>
-        <w:t xml:space="preserve"> </w:t>
-      </w:r>
-      <w:r>
-        <w:fldChar w:fldCharType="begin"/>
-      </w:r>
-      <w:r>
-        <w:rPr>
-          <w:lang w:val="ru-RU"/>
-        </w:rPr>
-        <w:instrText xml:space="preserve"> </w:instrText>
-      </w:r>
-      <w:r>
-        <w:instrText>REF</w:instrText>
-      </w:r>
-      <w:r>
-        <w:rPr>
-          <w:lang w:val="ru-RU"/>
-        </w:rPr>
-        <w:instrText xml:space="preserve"> _</w:instrText>
-      </w:r>
-      <w:r>
-        <w:instrText>Ref</w:instrText>
-      </w:r>
-      <w:r>
-        <w:rPr>
-          <w:lang w:val="ru-RU"/>
-        </w:rPr>
-        <w:instrText>198105518 \</w:instrText>
-      </w:r>
-      <w:r>
-        <w:instrText>h</w:instrText>
-      </w:r>
-      <w:r>
-        <w:rPr>
-          <w:lang w:val="ru-RU"/>
-        </w:rPr>
-        <w:instrText xml:space="preserve"> </w:instrText>
-      </w:r>
-      <w:r>
-        <w:fldChar w:fldCharType="separate"/>
-      </w:r>
-      <w:r>
-        <w:rPr>
-          <w:noProof/>
-          <w:lang w:val="ru-RU"/>
-        </w:rPr>
-        <w:t>1</w:t>
-      </w:r>
-      <w:r>
-        <w:fldChar w:fldCharType="end"/>
-      </w:r>
-      <w:r>
-        <w:rPr>
-          <w:lang w:val="ru-RU"/>
-        </w:rPr>
-        <w:t>.</w:t>
-      </w:r>
-    </w:p>
-    <w:p>
-      <w:pPr>
-        <w:pStyle w:val="a1"/>
-      </w:pPr>
-      <w:r>
-        <w:rPr>
-          <w:lang w:val="ru-RU"/>
-        </w:rPr>
         <w:tab/>
       </w:r>
       <w:bookmarkStart w:id="6" w:name="_Ref197943477"/>
@@ -2273,14 +2273,14 @@
         <w:rPr>
           <w:lang w:val="ru-RU"/>
         </w:rPr>
-        <w:t xml:space="preserve">цепи. Затем, в процессе заряда конденсатора, происходит считывание значения напряжения через АЦП с фикисрованной частотой измерений и последующее сохранение данных в массив. По достижении 97% максимального значения напряжения (на учебных платах максимальное напряжение составило 2.67В) на цифровой выход подаётся 0В, из-за чего </w:t>
+        <w:t xml:space="preserve">цепи. Затем, в процессе заряда конденсатора, происходит считывание значения напряжения через АЦП с фикисрованной частотой измерений и последующее сохранение данных в массив. По достижении 97% максимального значения напряжения (на учебных платах максимальное напряжение составило 2.67В) на цифровой выход подаётся 0В, из-за чего начинается разрядка конденсатора. Аналогично происходит считывание напряжения через АЦП. Когда напряжение стало на 2% выше диапазона между минимальноым (которое на </w:t>
       </w:r>
       <w:r>
         <w:rPr>
           <w:lang w:val="ru-RU"/>
         </w:rPr>
         <w:lastRenderedPageBreak/>
-        <w:t>начинается разрядка конденсатора. Аналогично происходит считывание напряжения через АЦП. Когда напряжение стало на 2% выше диапазона между минимальноым (которое на учебной плате составляет 2.48В) и максимальным значением напряжения (то есть, когда напряжение стало 2.50В), измерения заканчиваются.</w:t>
+        <w:t>учебной плате составляет 2.48В) и максимальным значением напряжения (то есть, когда напряжение стало 2.50В), измерения заканчиваются.</w:t>
       </w:r>
     </w:p>
     <w:p>
@@ -2567,7 +2567,19 @@
         <w:rPr>
           <w:lang w:val="ru-RU"/>
         </w:rPr>
-        <w:t>В ходе работы была исследована и экспериментально подтверждена экспериментальная зависимость напряжения на конденсаторе при его зарядке и разрядке.</w:t>
+        <w:t>В ходе работы была исследована и экспериментально подтвержде</w:t>
+      </w:r>
+      <w:r>
+        <w:rPr>
+          <w:lang w:val="ru-RU"/>
+        </w:rPr>
+        <w:t>на теоретическая</w:t>
+      </w:r>
+      <w:r>
+        <w:rPr>
+          <w:lang w:val="ru-RU"/>
+        </w:rPr>
+        <w:t xml:space="preserve"> зависимость напряжения на конденсаторе при его зарядке и разрядке.</w:t>
       </w:r>
     </w:p>
     <w:sectPr>
@@ -3383,7 +3395,7 @@
     <w:link w:val="Heading1Char"/>
     <w:uiPriority w:val="9"/>
     <w:qFormat/>
-    <w:rsid w:val="00A36ACB"/>
+    <w:rsid w:val="002123D4"/>
     <w:pPr>
       <w:keepNext/>
       <w:keepLines/>
@@ -3391,6 +3403,7 @@
         <w:numId w:val="3"/>
       </w:numPr>
       <w:spacing w:before="284" w:after="284"/>
+      <w:ind w:left="567" w:hanging="567"/>
       <w:outlineLvl w:val="0"/>
     </w:pPr>
     <w:rPr>
@@ -3408,7 +3421,7 @@
     <w:uiPriority w:val="9"/>
     <w:unhideWhenUsed/>
     <w:qFormat/>
-    <w:rsid w:val="00A36ACB"/>
+    <w:rsid w:val="000E5ED7"/>
     <w:pPr>
       <w:numPr>
         <w:ilvl w:val="1"/>
@@ -3417,7 +3430,6 @@
       <w:outlineLvl w:val="1"/>
     </w:pPr>
     <w:rPr>
-      <w:rFonts w:asciiTheme="majorHAnsi" w:hAnsiTheme="majorHAnsi"/>
       <w:szCs w:val="32"/>
     </w:rPr>
   </w:style>
@@ -3634,7 +3646,7 @@
     <w:basedOn w:val="DefaultParagraphFont"/>
     <w:link w:val="Heading1"/>
     <w:uiPriority w:val="9"/>
-    <w:rsid w:val="00A36ACB"/>
+    <w:rsid w:val="002123D4"/>
     <w:rPr>
       <w:rFonts w:ascii="Arial" w:eastAsiaTheme="majorEastAsia" w:hAnsi="Arial" w:cstheme="majorBidi"/>
       <w:b/>
@@ -3647,9 +3659,9 @@
     <w:basedOn w:val="DefaultParagraphFont"/>
     <w:link w:val="Heading2"/>
     <w:uiPriority w:val="9"/>
-    <w:rsid w:val="00A36ACB"/>
+    <w:rsid w:val="000E5ED7"/>
     <w:rPr>
-      <w:rFonts w:asciiTheme="majorHAnsi" w:eastAsiaTheme="majorEastAsia" w:hAnsiTheme="majorHAnsi" w:cstheme="majorBidi"/>
+      <w:rFonts w:ascii="Arial" w:eastAsiaTheme="majorEastAsia" w:hAnsi="Arial" w:cstheme="majorBidi"/>
       <w:b/>
       <w:sz w:val="32"/>
       <w:szCs w:val="32"/>

</xml_diff>

<commit_message>
Changed image to one more pretty
</commit_message>
<xml_diff>
--- a/Отчёт.docx
+++ b/Отчёт.docx
@@ -2437,13 +2437,19 @@
       <w:pPr>
         <w:pStyle w:val="a"/>
         <w:keepNext/>
-      </w:pPr>
-      <w:r>
+        <w:rPr>
+          <w:lang w:val="ru-RU"/>
+        </w:rPr>
+      </w:pPr>
+      <w:r>
+        <w:rPr>
+          <w:lang w:val="ru-RU"/>
+        </w:rPr>
         <w:drawing>
-          <wp:inline distT="0" distB="0" distL="0" distR="0" wp14:anchorId="29F4F434" wp14:editId="531A715E">
-            <wp:extent cx="5943600" cy="3714750"/>
-            <wp:effectExtent l="0" t="0" r="0" b="0"/>
-            <wp:docPr id="1354934818" name="Picture 1" descr="A graph with lines and text&#10;&#10;AI-generated content may be incorrect."/>
+          <wp:inline distT="0" distB="0" distL="0" distR="0" wp14:anchorId="2047A3B7" wp14:editId="06AFBC83">
+            <wp:extent cx="5943600" cy="3820795"/>
+            <wp:effectExtent l="0" t="0" r="0" b="8255"/>
+            <wp:docPr id="164435896" name="Graphic 1"/>
             <wp:cNvGraphicFramePr>
               <a:graphicFrameLocks xmlns:a="http://schemas.openxmlformats.org/drawingml/2006/main" noChangeAspect="1"/>
             </wp:cNvGraphicFramePr>
@@ -2451,36 +2457,29 @@
               <a:graphicData uri="http://schemas.openxmlformats.org/drawingml/2006/picture">
                 <pic:pic xmlns:pic="http://schemas.openxmlformats.org/drawingml/2006/picture">
                   <pic:nvPicPr>
-                    <pic:cNvPr id="1354934818" name="Picture 1" descr="A graph with lines and text&#10;&#10;AI-generated content may be incorrect."/>
-                    <pic:cNvPicPr>
-                      <a:picLocks noChangeAspect="1" noChangeArrowheads="1"/>
-                    </pic:cNvPicPr>
+                    <pic:cNvPr id="164435896" name=""/>
+                    <pic:cNvPicPr/>
                   </pic:nvPicPr>
                   <pic:blipFill>
-                    <a:blip r:embed="rId10" cstate="print">
+                    <a:blip r:embed="rId10">
                       <a:extLst>
-                        <a:ext uri="{28A0092B-C50C-407E-A947-70E740481C1C}">
-                          <a14:useLocalDpi xmlns:a14="http://schemas.microsoft.com/office/drawing/2010/main" val="0"/>
+                        <a:ext uri="{96DAC541-7B7A-43D3-8B79-37D633B846F1}">
+                          <asvg:svgBlip xmlns:asvg="http://schemas.microsoft.com/office/drawing/2016/SVG/main" r:embed="rId11"/>
                         </a:ext>
                       </a:extLst>
                     </a:blip>
-                    <a:srcRect/>
                     <a:stretch>
                       <a:fillRect/>
                     </a:stretch>
                   </pic:blipFill>
-                  <pic:spPr bwMode="auto">
+                  <pic:spPr>
                     <a:xfrm>
                       <a:off x="0" y="0"/>
-                      <a:ext cx="5943600" cy="3714750"/>
+                      <a:ext cx="5943600" cy="3820795"/>
                     </a:xfrm>
                     <a:prstGeom prst="rect">
                       <a:avLst/>
                     </a:prstGeom>
-                    <a:noFill/>
-                    <a:ln>
-                      <a:noFill/>
-                    </a:ln>
                   </pic:spPr>
                 </pic:pic>
               </a:graphicData>
@@ -2583,7 +2582,7 @@
       </w:r>
     </w:p>
     <w:sectPr>
-      <w:footerReference w:type="default" r:id="rId11"/>
+      <w:footerReference w:type="default" r:id="rId12"/>
       <w:pgSz w:w="12240" w:h="15840"/>
       <w:pgMar w:top="1440" w:right="1440" w:bottom="1440" w:left="1440" w:header="720" w:footer="720" w:gutter="0"/>
       <w:cols w:space="720"/>

</xml_diff>